<commit_message>
docs: add Lead Pipeline module to Sales Pitch Playbook docx
</commit_message>
<xml_diff>
--- a/VRT_Services_Sales_Pitch_Playbook.docx
+++ b/VRT_Services_Sales_Pitch_Playbook.docx
@@ -35,13 +35,7 @@
         <w:spacing w:after="280"/>
       </w:pPr>
       <w:r>
-        <w:rPr>
-          <w:rFonts w:ascii="Calibri" w:hAnsi="Calibri"/>
-          <w:i/>
-          <w:color w:val="64748B"/>
-          <w:sz w:val="26"/>
-        </w:rPr>
-        <w:t>Complete Sales Speech, Feature Playbook &amp; Pitch Deck for All 16 Core Modules</w:t>
+        <w:t>Complete Sales Speech, Feature Playbook &amp; Pitch Deck for All 17 Core Modules</w:t>
       </w:r>
     </w:p>
     <w:tbl>
@@ -123,55 +117,13 @@
         <w:spacing w:before="80" w:after="160" w:line="288" w:lineRule="auto"/>
       </w:pPr>
       <w:r>
-        <w:rPr>
-          <w:rFonts w:ascii="Calibri" w:hAnsi="Calibri"/>
-          <w:color w:val="1E293B"/>
-        </w:rPr>
         <w:t>“If you look at the typical tax and accounting practice today, you’ll find a frustrating mess of 6 to 10 disconnected tools: one app for customer contacts, another for expensive DocuSign seats, a Dropbox folder that clients struggle to use, tedious manual typing of bank statements into Excel, missed state or federal deadlines tracked on whiteboards, and scattered billing.</w:t>
-      </w:r>
-      <w:r>
-        <w:rPr>
-          <w:rFonts w:ascii="Calibri" w:hAnsi="Calibri"/>
-          <w:color w:val="1E293B"/>
-        </w:rPr>
         <w:br/>
-      </w:r>
-      <w:r>
-        <w:rPr>
-          <w:rFonts w:ascii="Calibri" w:hAnsi="Calibri"/>
-          <w:color w:val="1E293B"/>
-        </w:rPr>
         <w:br/>
         <w:t>We built VRT Services to end that chaos forever.</w:t>
-      </w:r>
-      <w:r>
-        <w:rPr>
-          <w:rFonts w:ascii="Calibri" w:hAnsi="Calibri"/>
-          <w:color w:val="1E293B"/>
-        </w:rPr>
         <w:br/>
-      </w:r>
-      <w:r>
-        <w:rPr>
-          <w:rFonts w:ascii="Calibri" w:hAnsi="Calibri"/>
-          <w:color w:val="1E293B"/>
-        </w:rPr>
         <w:br/>
-        <w:t>VRT Services unites AI Vision OCR bank statement extraction, an IRS-compliant self-hosted E-Signature engine, an automated compliance deadline calendar, recurring billing,</w:t>
-      </w:r>
-      <w:r>
-        <w:rPr>
-          <w:rFonts w:ascii="Calibri" w:hAnsi="Calibri"/>
-          <w:color w:val="1E293B"/>
-        </w:rPr>
-        <w:t xml:space="preserve"> Drake Import,</w:t>
-      </w:r>
-      <w:r>
-        <w:rPr>
-          <w:rFonts w:ascii="Calibri" w:hAnsi="Calibri"/>
-          <w:color w:val="1E293B"/>
-        </w:rPr>
-        <w:t xml:space="preserve"> direct QuickBooks sync, and an authenticated client portal into one single platform. Your team prepares returns up to 65% faster, your clients get a frictionless digital experience, and your firm recaptures thousands of lost billable hours.”</w:t>
+        <w:t>VRT Services unites an inbound Lead pipeline with bilingual AI proposal generation, AI Vision OCR bank statement extraction, an IRS-compliant self-hosted E-Signature engine, an automated compliance deadline calendar, recurring billing, Drake Import, direct QuickBooks sync, and an authenticated client portal into one single platform. Your team prepares returns up to 65% faster, your clients get a frictionless digital experience, and your firm recaptures thousands of lost billable hours.”</w:t>
       </w:r>
     </w:p>
     <w:p>
@@ -199,6 +151,26 @@
           <w:color w:val="334155"/>
         </w:rPr>
         <w:t>What makes VRT Services unbeatable is that its modules do not operate in silos. Every action automatically triggers the next logical step in the firm's workflow:</w:t>
+      </w:r>
+    </w:p>
+    <w:p>
+      <w:pPr>
+        <w:pStyle w:val="ListBullet"/>
+      </w:pPr>
+      <w:r>
+        <w:rPr>
+          <w:rFonts w:ascii="Calibri" w:hAnsi="Calibri"/>
+          <w:b/>
+          <w:sz w:val="21"/>
+        </w:rPr>
+        <w:t xml:space="preserve">Inbound Lead Pipeline &amp; AI Proposal Engine: </w:t>
+      </w:r>
+      <w:r>
+        <w:rPr>
+          <w:rFonts w:ascii="Calibri" w:hAnsi="Calibri"/>
+          <w:sz w:val="21"/>
+        </w:rPr>
+        <w:t>Prospects are captured into a 7-stage pipeline, receive tailored, industry-specific AI proposals in English or Spanish in seconds, and convert into active CRM customers with a single click.</w:t>
       </w:r>
     </w:p>
     <w:p>
@@ -3895,6 +3867,257 @@
                 <w:sz w:val="21"/>
               </w:rPr>
               <w:t>“Protect your clients and your license with enterprise-grade defense. VRT Services features full Role-Based Access Control (Admin, Tax Manager, Tax Preparer, QC Reviewer), ensuring staff only access the files and actions they are authorized to see. Every user account supports mandatory 2FA / TOTP authenticator app pairing, and our immutable audit log tracks every login, document view, deletion, and status change with exportable CSV audit trails.”</w:t>
+            </w:r>
+          </w:p>
+        </w:tc>
+      </w:tr>
+    </w:tbl>
+    <w:p>
+      <w:pPr/>
+    </w:p>
+    <w:p>
+      <w:pPr/>
+      <w:r>
+        <w:rPr>
+          <w:rFonts w:ascii="Calibri" w:hAnsi="Calibri"/>
+          <w:b/>
+          <w:color w:val="0284C7"/>
+          <w:sz w:val="28"/>
+        </w:rPr>
+        <w:t>Module 17: Inbound Lead Pipeline &amp; AI Proposal Acquisition Hub</w:t>
+      </w:r>
+    </w:p>
+    <w:p>
+      <w:pPr/>
+      <w:r>
+        <w:rPr>
+          <w:rFonts w:ascii="Calibri" w:hAnsi="Calibri"/>
+          <w:b/>
+          <w:color w:val="7C3AED"/>
+          <w:sz w:val="22"/>
+        </w:rPr>
+        <w:t>« Turn Cold Inquiries into High-Value Retainer Clients with Instant Bilingual AI Pitches »</w:t>
+      </w:r>
+    </w:p>
+    <w:p>
+      <w:pPr/>
+      <w:r>
+        <w:rPr>
+          <w:rFonts w:ascii="Calibri" w:hAnsi="Calibri"/>
+          <w:b/>
+          <w:sz w:val="21"/>
+        </w:rPr>
+        <w:t xml:space="preserve">⚠️ The Industry Frustration: </w:t>
+      </w:r>
+      <w:r>
+        <w:rPr>
+          <w:rFonts w:ascii="Calibri" w:hAnsi="Calibri"/>
+          <w:sz w:val="21"/>
+        </w:rPr>
+        <w:t>Tax and accounting firms lose up to 50% of inbound leads because they take days to respond with custom quotes or send generic, uninspiring email templates. Preparers waste billable hours drafting proposals from scratch, struggle to explain industry-specific tax deductions to trade prospects, and fumble handoffs into their CRM, leading to lost revenue and friction.</w:t>
+      </w:r>
+    </w:p>
+    <w:p>
+      <w:pPr/>
+    </w:p>
+    <w:p>
+      <w:pPr/>
+      <w:r>
+        <w:rPr>
+          <w:rFonts w:ascii="Calibri" w:hAnsi="Calibri"/>
+          <w:b/>
+          <w:sz w:val="22"/>
+        </w:rPr>
+        <w:t>Key Capabilities &amp; Differentiators:</w:t>
+      </w:r>
+    </w:p>
+    <w:p>
+      <w:pPr>
+        <w:pStyle w:val="ListBullet"/>
+      </w:pPr>
+      <w:r>
+        <w:rPr>
+          <w:rFonts w:ascii="Calibri" w:hAnsi="Calibri"/>
+          <w:b/>
+          <w:sz w:val="21"/>
+        </w:rPr>
+        <w:t xml:space="preserve">Visual 7-Stage Pipeline Tracking: </w:t>
+      </w:r>
+      <w:r>
+        <w:rPr>
+          <w:rFonts w:ascii="Calibri" w:hAnsi="Calibri"/>
+          <w:sz w:val="21"/>
+        </w:rPr>
+        <w:t>Real-time Kanban-style pipeline tracking across In Review, Contacted, Booked, Maybe, Won, Lost, and Processed with dynamic status color badges.</w:t>
+      </w:r>
+    </w:p>
+    <w:p>
+      <w:pPr>
+        <w:pStyle w:val="ListBullet"/>
+      </w:pPr>
+      <w:r>
+        <w:rPr>
+          <w:rFonts w:ascii="Calibri" w:hAnsi="Calibri"/>
+          <w:b/>
+          <w:sz w:val="21"/>
+        </w:rPr>
+        <w:t xml:space="preserve">Bilingual AI Sales Pitch Generator (English &amp; Spanish 🇪🇸): </w:t>
+      </w:r>
+      <w:r>
+        <w:rPr>
+          <w:rFonts w:ascii="Calibri" w:hAnsi="Calibri"/>
+          <w:sz w:val="21"/>
+        </w:rPr>
+        <w:t>Generates tailored 4-paragraph proposals in seconds positioning VRT Services exclusively in tax preparation, bookkeeping, payroll, and CFO advisory—highlighting specific write-offs and deductions for the prospect's industry.</w:t>
+      </w:r>
+    </w:p>
+    <w:p>
+      <w:pPr>
+        <w:pStyle w:val="ListBullet"/>
+      </w:pPr>
+      <w:r>
+        <w:rPr>
+          <w:rFonts w:ascii="Calibri" w:hAnsi="Calibri"/>
+          <w:b/>
+          <w:sz w:val="21"/>
+        </w:rPr>
+        <w:t xml:space="preserve">Automated Discovery Assessment Link: </w:t>
+      </w:r>
+      <w:r>
+        <w:rPr>
+          <w:rFonts w:ascii="Calibri" w:hAnsi="Calibri"/>
+          <w:sz w:val="21"/>
+        </w:rPr>
+        <w:t>One-click email trigger dispatching a digital discovery assessment questionnaire directly to prospects via Resend API to accelerate qualification.</w:t>
+      </w:r>
+    </w:p>
+    <w:p>
+      <w:pPr>
+        <w:pStyle w:val="ListBullet"/>
+      </w:pPr>
+      <w:r>
+        <w:rPr>
+          <w:rFonts w:ascii="Calibri" w:hAnsi="Calibri"/>
+          <w:b/>
+          <w:sz w:val="21"/>
+        </w:rPr>
+        <w:t xml:space="preserve">1-Click Direct Customer Conversion: </w:t>
+      </w:r>
+      <w:r>
+        <w:rPr>
+          <w:rFonts w:ascii="Calibri" w:hAnsi="Calibri"/>
+          <w:sz w:val="21"/>
+        </w:rPr>
+        <w:t>Seamlessly converts any won lead into an official active CRM customer—automatically generating sequential customer numbers (e.g., CUST-XXXX), porting contact data, and linking intake notes.</w:t>
+      </w:r>
+    </w:p>
+    <w:p>
+      <w:pPr>
+        <w:pStyle w:val="ListBullet"/>
+      </w:pPr>
+      <w:r>
+        <w:rPr>
+          <w:rFonts w:ascii="Calibri" w:hAnsi="Calibri"/>
+          <w:b/>
+          <w:sz w:val="21"/>
+        </w:rPr>
+        <w:t xml:space="preserve">Customer-Grade Resend Emailing Suite: </w:t>
+      </w:r>
+      <w:r>
+        <w:rPr>
+          <w:rFonts w:ascii="Calibri" w:hAnsi="Calibri"/>
+          <w:sz w:val="21"/>
+        </w:rPr>
+        <w:t>Launches the firm's rich email modal directly from the pipeline table to approve AI pitches or send personalized follow-ups without tab switching.</w:t>
+      </w:r>
+    </w:p>
+    <w:p>
+      <w:pPr>
+        <w:pStyle w:val="ListBullet"/>
+      </w:pPr>
+      <w:r>
+        <w:rPr>
+          <w:rFonts w:ascii="Calibri" w:hAnsi="Calibri"/>
+          <w:b/>
+          <w:sz w:val="21"/>
+        </w:rPr>
+        <w:t xml:space="preserve">Isolated Safe Lead Deletion: </w:t>
+      </w:r>
+      <w:r>
+        <w:rPr>
+          <w:rFonts w:ascii="Calibri" w:hAnsi="Calibri"/>
+          <w:sz w:val="21"/>
+        </w:rPr>
+        <w:t>Built-in deletion confirmation modals and dedicated database cascades ensuring leads are safely purged without ever altering or deleting active customer records.</w:t>
+      </w:r>
+    </w:p>
+    <w:p>
+      <w:pPr/>
+      <w:r>
+        <w:rPr>
+          <w:rFonts w:ascii="Calibri" w:hAnsi="Calibri"/>
+          <w:b/>
+          <w:sz w:val="21"/>
+        </w:rPr>
+        <w:t xml:space="preserve">💰 Bottom-Line Impact &amp; ROI: </w:t>
+      </w:r>
+      <w:r>
+        <w:rPr>
+          <w:rFonts w:ascii="Calibri" w:hAnsi="Calibri"/>
+          <w:sz w:val="21"/>
+        </w:rPr>
+        <w:t>Accelerates lead response time from 48 hours to under 60 seconds, lifts prospect conversion rates by up to 35%, and eliminates non-billable proposal writing for firm partners.</w:t>
+      </w:r>
+    </w:p>
+    <w:p>
+      <w:pPr/>
+    </w:p>
+    <w:tbl>
+      <w:tblPr>
+        <w:tblW w:w="0" w:type="auto"/>
+        <w:jc w:val="center"/>
+        <w:tblLayout w:type="fixed"/>
+        <w:tblLook w:val="04A0" w:firstRow="1" w:lastRow="0" w:firstColumn="1" w:lastColumn="0" w:noHBand="0" w:noVBand="1"/>
+      </w:tblPr>
+      <w:tblGrid>
+        <w:gridCol w:w="9360"/>
+      </w:tblGrid>
+      <w:tr>
+        <w:trPr>
+          <w:jc w:val="center"/>
+        </w:trPr>
+        <w:tc>
+          <w:tcPr>
+            <w:tcW w:w="9360" w:type="dxa"/>
+            <w:tcBorders>
+              <w:left w:val="single" w:sz="36" w:space="0" w:color="0284C7"/>
+            </w:tcBorders>
+            <w:shd w:val="clear" w:color="auto" w:fill="F8FAFC"/>
+            <w:tcMar>
+              <w:top w:w="140" w:type="dxa"/>
+              <w:left w:w="200" w:type="dxa"/>
+              <w:bottom w:w="140" w:type="dxa"/>
+              <w:right w:w="200" w:type="dxa"/>
+            </w:tcMar>
+          </w:tcPr>
+          <w:p>
+            <w:r>
+              <w:rPr>
+                <w:rFonts w:ascii="Calibri" w:hAnsi="Calibri"/>
+                <w:b/>
+                <w:color w:val="0284C7"/>
+                <w:sz w:val="21"/>
+              </w:rPr>
+              <w:t xml:space="preserve">📌 THE WINNING SALES PITCH: </w:t>
+            </w:r>
+            <w:r>
+              <w:rPr>
+                <w:rFonts w:ascii="Calibri" w:hAnsi="Calibri"/>
+                <w:i/>
+                <w:color w:val="1E293B"/>
+                <w:sz w:val="21"/>
+              </w:rPr>
+              <w:t>“Never let another high-value tax or bookkeeping lead slip through the cracks. With VRT Services' Lead Pipeline, your firm responds in seconds with persuasive, industry-tailored proposals in fluent English or Spanish. When they say yes, a single click converts them into a fully provisioned client in your CRM—complete with their custom customer ID, discovery history, and compliance workflow ready to roll.”</w:t>
             </w:r>
           </w:p>
         </w:tc>
@@ -5595,6 +5818,50 @@
           </w:p>
         </w:tc>
       </w:tr>
+      <w:tr>
+        <w:tc>
+          <w:tcPr>
+            <w:tcW w:type="dxa" w:w="3168"/>
+          </w:tcPr>
+          <w:p>
+            <w:r>
+              <w:rPr>
+                <w:rFonts w:ascii="Calibri" w:hAnsi="Calibri"/>
+                <w:sz w:val="20"/>
+              </w:rPr>
+              <w:t>Inbound Lead Pipeline &amp; AI Proposal Hub</w:t>
+            </w:r>
+          </w:p>
+        </w:tc>
+        <w:tc>
+          <w:tcPr>
+            <w:tcW w:type="dxa" w:w="3888"/>
+          </w:tcPr>
+          <w:p>
+            <w:r>
+              <w:rPr>
+                <w:rFonts w:ascii="Calibri" w:hAnsi="Calibri"/>
+                <w:sz w:val="20"/>
+              </w:rPr>
+              <w:t>Instant bilingual AI pitch generation &amp; 1-click CRM customer conversion</w:t>
+            </w:r>
+          </w:p>
+        </w:tc>
+        <w:tc>
+          <w:tcPr>
+            <w:tcW w:type="dxa" w:w="2880"/>
+          </w:tcPr>
+          <w:p>
+            <w:r>
+              <w:rPr>
+                <w:rFonts w:ascii="Calibri" w:hAnsi="Calibri"/>
+                <w:sz w:val="20"/>
+              </w:rPr>
+              <w:t>HubSpot / Pipedrive subscriptions &amp; manual email drafting</w:t>
+            </w:r>
+          </w:p>
+        </w:tc>
+      </w:tr>
     </w:tbl>
     <w:p>
       <w:pPr>

</xml_diff>